<commit_message>
content: remove unconfirmed roofs/jobs stat card
No count available, so drop the placeholder card that was showing
[[CONFIRM: roofs / jobs completed]] on the live page. Why-choose-us now
shows two cards (15 years, 5-year certificate); grid switched to 2 cols
so they sit balanced. Removes the last visible placeholder before go-live.
</commit_message>
<xml_diff>
--- a/Nkosi-Thatchers-WordPress-Checklist.docx
+++ b/Nkosi-Thatchers-WordPress-Checklist.docx
@@ -529,8 +529,77 @@
           <w:color w:val="5A3E28"/>
           <w:sz w:val="28"/>
         </w:rPr>
-        <w:t>Make the contact form work (Formspree)</w:t>
+        <w:t>Contact form — already connected</w:t>
       </w:r>
+    </w:p>
+    <w:tbl>
+      <w:tblPr>
+        <w:tblW w:type="auto" w:w="0"/>
+        <w:tblLayout w:type="fixed"/>
+        <w:tblLook w:firstColumn="1" w:firstRow="1" w:lastColumn="0" w:lastRow="0" w:noHBand="0" w:noVBand="1" w:val="04A0"/>
+      </w:tblPr>
+      <w:tblGrid>
+        <w:gridCol w:w="9638"/>
+      </w:tblGrid>
+      <w:tr>
+        <w:tc>
+          <w:tcPr>
+            <w:tcW w:type="dxa" w:w="9638"/>
+            <w:shd w:val="clear" w:color="auto" w:fill="F3E9D6"/>
+            <w:tcBorders>
+              <w:left w:val="single" w:sz="20" w:space="0" w:color="C6871E"/>
+              <w:top w:val="single" w:sz="6" w:space="0" w:color="C6871E"/>
+              <w:bottom w:val="single" w:sz="6" w:space="0" w:color="C6871E"/>
+              <w:right w:val="single" w:sz="6" w:space="0" w:color="C6871E"/>
+            </w:tcBorders>
+          </w:tcPr>
+          <w:p>
+            <w:pPr>
+              <w:spacing w:after="0"/>
+            </w:pPr>
+            <w:r>
+              <w:rPr>
+                <w:b/>
+                <w:color w:val="5A3E28"/>
+                <w:sz w:val="20"/>
+              </w:rPr>
+              <w:t xml:space="preserve">Already done:  </w:t>
+            </w:r>
+            <w:r>
+              <w:rPr>
+                <w:rFonts w:ascii="Calibri" w:hAnsi="Calibri"/>
+                <w:b w:val="0"/>
+                <w:color w:val="2A2724"/>
+                <w:sz w:val="20"/>
+              </w:rPr>
+              <w:t xml:space="preserve">the form is wired to Formspree </w:t>
+            </w:r>
+            <w:r>
+              <w:rPr>
+                <w:rFonts w:ascii="Consolas" w:hAnsi="Consolas"/>
+                <w:b w:val="0"/>
+                <w:color w:val="5A3E28"/>
+                <w:sz w:val="20"/>
+              </w:rPr>
+              <w:t>(formspree.io/f/xbgrvrre)</w:t>
+            </w:r>
+            <w:r>
+              <w:rPr>
+                <w:rFonts w:ascii="Calibri" w:hAnsi="Calibri"/>
+                <w:b w:val="0"/>
+                <w:color w:val="2A2724"/>
+                <w:sz w:val="20"/>
+              </w:rPr>
+              <w:t xml:space="preserve"> inside this theme. No file editing needed — just confirm it works.</w:t>
+            </w:r>
+          </w:p>
+        </w:tc>
+      </w:tr>
+    </w:tbl>
+    <w:p>
+      <w:pPr>
+        <w:spacing w:after="40"/>
+      </w:pPr>
     </w:p>
     <w:p>
       <w:pPr>
@@ -563,7 +632,7 @@
           <w:color w:val="2A2724"/>
           <w:sz w:val="22"/>
         </w:rPr>
-        <w:t xml:space="preserve">Go to </w:t>
+        <w:t xml:space="preserve">Once the site is live, submit the </w:t>
       </w:r>
       <w:r>
         <w:rPr>
@@ -572,7 +641,16 @@
           <w:color w:val="2A2724"/>
           <w:sz w:val="22"/>
         </w:rPr>
-        <w:t>Appearance → Theme File Editor</w:t>
+        <w:t>contact form</w:t>
+      </w:r>
+      <w:r>
+        <w:rPr>
+          <w:rFonts w:ascii="Calibri" w:hAnsi="Calibri"/>
+          <w:b w:val="0"/>
+          <w:color w:val="2A2724"/>
+          <w:sz w:val="22"/>
+        </w:rPr>
+        <w:t xml:space="preserve"> once with your own details (a test).</w:t>
       </w:r>
     </w:p>
     <w:p>
@@ -606,16 +684,25 @@
           <w:color w:val="2A2724"/>
           <w:sz w:val="22"/>
         </w:rPr>
-        <w:t xml:space="preserve">In the file list on the right, click </w:t>
+        <w:t xml:space="preserve">Formspree emails a </w:t>
       </w:r>
       <w:r>
         <w:rPr>
-          <w:rFonts w:ascii="Consolas" w:hAnsi="Consolas"/>
+          <w:rFonts w:ascii="Calibri" w:hAnsi="Calibri"/>
+          <w:b/>
+          <w:color w:val="2A2724"/>
+          <w:sz w:val="22"/>
+        </w:rPr>
+        <w:t>one-time confirmation</w:t>
+      </w:r>
+      <w:r>
+        <w:rPr>
+          <w:rFonts w:ascii="Calibri" w:hAnsi="Calibri"/>
           <w:b w:val="0"/>
-          <w:color w:val="5A3E28"/>
-          <w:sz w:val="20"/>
+          <w:color w:val="2A2724"/>
+          <w:sz w:val="22"/>
         </w:rPr>
-        <w:t>index.php</w:t>
+        <w:t xml:space="preserve"> the first time — open it and click the link to activate forwarding.</w:t>
       </w:r>
     </w:p>
     <w:p>
@@ -649,7 +736,7 @@
           <w:color w:val="2A2724"/>
           <w:sz w:val="22"/>
         </w:rPr>
-        <w:t xml:space="preserve">Press </w:t>
+        <w:t xml:space="preserve">(Optional) In the Formspree dashboard → your form → </w:t>
       </w:r>
       <w:r>
         <w:rPr>
@@ -658,7 +745,7 @@
           <w:color w:val="2A2724"/>
           <w:sz w:val="22"/>
         </w:rPr>
-        <w:t>Ctrl+F</w:t>
+        <w:t>Settings → Emails</w:t>
       </w:r>
       <w:r>
         <w:rPr>
@@ -667,7 +754,7 @@
           <w:color w:val="2A2724"/>
           <w:sz w:val="22"/>
         </w:rPr>
-        <w:t xml:space="preserve"> in the code box and search for </w:t>
+        <w:t xml:space="preserve">, set the recipient to </w:t>
       </w:r>
       <w:r>
         <w:rPr>
@@ -676,32 +763,7 @@
           <w:color w:val="5A3E28"/>
           <w:sz w:val="20"/>
         </w:rPr>
-        <w:t>YOUR_FORM_ID</w:t>
-      </w:r>
-    </w:p>
-    <w:p>
-      <w:pPr>
-        <w:spacing w:after="120"/>
-        <w:ind w:left="200"/>
-      </w:pPr>
-      <w:r>
-        <w:rPr>
-          <w:rFonts w:ascii="Segoe UI Symbol" w:hAnsi="Segoe UI Symbol"/>
-          <w:color w:val="5A3E28"/>
-          <w:sz w:val="26"/>
-        </w:rPr>
-        <w:t>☐</w:t>
-      </w:r>
-      <w:r>
-        <w:t xml:space="preserve">   </w:t>
-      </w:r>
-      <w:r>
-        <w:rPr>
-          <w:b/>
-          <w:color w:val="2A2724"/>
-          <w:sz w:val="22"/>
-        </w:rPr>
-        <w:t xml:space="preserve">10. </w:t>
+        <w:t>info@nkosithatchers.com</w:t>
       </w:r>
       <w:r>
         <w:rPr>
@@ -710,147 +772,8 @@
           <w:color w:val="2A2724"/>
           <w:sz w:val="22"/>
         </w:rPr>
-        <w:t xml:space="preserve">Replace </w:t>
+        <w:t>.</w:t>
       </w:r>
-      <w:r>
-        <w:rPr>
-          <w:rFonts w:ascii="Consolas" w:hAnsi="Consolas"/>
-          <w:b w:val="0"/>
-          <w:color w:val="5A3E28"/>
-          <w:sz w:val="20"/>
-        </w:rPr>
-        <w:t>YOUR_FORM_ID</w:t>
-      </w:r>
-      <w:r>
-        <w:rPr>
-          <w:rFonts w:ascii="Calibri" w:hAnsi="Calibri"/>
-          <w:b w:val="0"/>
-          <w:color w:val="2A2724"/>
-          <w:sz w:val="22"/>
-        </w:rPr>
-        <w:t xml:space="preserve"> with your Formspree ID, e.g. </w:t>
-      </w:r>
-      <w:r>
-        <w:rPr>
-          <w:rFonts w:ascii="Consolas" w:hAnsi="Consolas"/>
-          <w:b w:val="0"/>
-          <w:color w:val="5A3E28"/>
-          <w:sz w:val="20"/>
-        </w:rPr>
-        <w:t>action="https://formspree.io/f/abcdwxyz"</w:t>
-      </w:r>
-    </w:p>
-    <w:p>
-      <w:pPr>
-        <w:spacing w:after="120"/>
-        <w:ind w:left="200"/>
-      </w:pPr>
-      <w:r>
-        <w:rPr>
-          <w:rFonts w:ascii="Segoe UI Symbol" w:hAnsi="Segoe UI Symbol"/>
-          <w:color w:val="5A3E28"/>
-          <w:sz w:val="26"/>
-        </w:rPr>
-        <w:t>☐</w:t>
-      </w:r>
-      <w:r>
-        <w:t xml:space="preserve">   </w:t>
-      </w:r>
-      <w:r>
-        <w:rPr>
-          <w:b/>
-          <w:color w:val="2A2724"/>
-          <w:sz w:val="22"/>
-        </w:rPr>
-        <w:t xml:space="preserve">11. </w:t>
-      </w:r>
-      <w:r>
-        <w:rPr>
-          <w:rFonts w:ascii="Calibri" w:hAnsi="Calibri"/>
-          <w:b w:val="0"/>
-          <w:color w:val="2A2724"/>
-          <w:sz w:val="22"/>
-        </w:rPr>
-        <w:t xml:space="preserve">Click </w:t>
-      </w:r>
-      <w:r>
-        <w:rPr>
-          <w:rFonts w:ascii="Calibri" w:hAnsi="Calibri"/>
-          <w:b/>
-          <w:color w:val="2A2724"/>
-          <w:sz w:val="22"/>
-        </w:rPr>
-        <w:t>Update File</w:t>
-      </w:r>
-    </w:p>
-    <w:tbl>
-      <w:tblPr>
-        <w:tblW w:type="auto" w:w="0"/>
-        <w:tblLayout w:type="fixed"/>
-        <w:tblLook w:firstColumn="1" w:firstRow="1" w:lastColumn="0" w:lastRow="0" w:noHBand="0" w:noVBand="1" w:val="04A0"/>
-      </w:tblPr>
-      <w:tblGrid>
-        <w:gridCol w:w="9638"/>
-      </w:tblGrid>
-      <w:tr>
-        <w:tc>
-          <w:tcPr>
-            <w:tcW w:type="dxa" w:w="9638"/>
-            <w:shd w:val="clear" w:color="auto" w:fill="F3E9D6"/>
-            <w:tcBorders>
-              <w:left w:val="single" w:sz="20" w:space="0" w:color="C6871E"/>
-              <w:top w:val="single" w:sz="6" w:space="0" w:color="C6871E"/>
-              <w:bottom w:val="single" w:sz="6" w:space="0" w:color="C6871E"/>
-              <w:right w:val="single" w:sz="6" w:space="0" w:color="C6871E"/>
-            </w:tcBorders>
-          </w:tcPr>
-          <w:p>
-            <w:pPr>
-              <w:spacing w:after="0"/>
-            </w:pPr>
-            <w:r>
-              <w:rPr>
-                <w:b/>
-                <w:color w:val="5A3E28"/>
-                <w:sz w:val="20"/>
-              </w:rPr>
-              <w:t xml:space="preserve">No Formspree account yet?  </w:t>
-            </w:r>
-            <w:r>
-              <w:rPr>
-                <w:rFonts w:ascii="Calibri" w:hAnsi="Calibri"/>
-                <w:b w:val="0"/>
-                <w:color w:val="2A2724"/>
-                <w:sz w:val="20"/>
-              </w:rPr>
-              <w:t xml:space="preserve">Go to </w:t>
-            </w:r>
-            <w:r>
-              <w:rPr>
-                <w:rFonts w:ascii="Consolas" w:hAnsi="Consolas"/>
-                <w:b w:val="0"/>
-                <w:color w:val="5A3E28"/>
-                <w:sz w:val="20"/>
-              </w:rPr>
-              <w:t>formspree.io</w:t>
-            </w:r>
-            <w:r>
-              <w:rPr>
-                <w:rFonts w:ascii="Calibri" w:hAnsi="Calibri"/>
-                <w:b w:val="0"/>
-                <w:color w:val="2A2724"/>
-                <w:sz w:val="20"/>
-              </w:rPr>
-              <w:t xml:space="preserve"> → create a form → it gives you the ID. The first real submission asks you to confirm by email.</w:t>
-            </w:r>
-          </w:p>
-        </w:tc>
-      </w:tr>
-    </w:tbl>
-    <w:p>
-      <w:pPr>
-        <w:spacing w:after="40"/>
-      </w:pPr>
     </w:p>
     <w:p>
       <w:pPr>
@@ -898,7 +821,7 @@
           <w:color w:val="2A2724"/>
           <w:sz w:val="22"/>
         </w:rPr>
-        <w:t xml:space="preserve">12. </w:t>
+        <w:t xml:space="preserve">10. </w:t>
       </w:r>
       <w:r>
         <w:rPr>
@@ -1004,7 +927,7 @@
           <w:color w:val="2A2724"/>
           <w:sz w:val="22"/>
         </w:rPr>
-        <w:t xml:space="preserve">13. </w:t>
+        <w:t xml:space="preserve">11. </w:t>
       </w:r>
       <w:r>
         <w:rPr>
@@ -1074,7 +997,7 @@
           <w:color w:val="2A2724"/>
           <w:sz w:val="22"/>
         </w:rPr>
-        <w:t xml:space="preserve">14. </w:t>
+        <w:t xml:space="preserve">12. </w:t>
       </w:r>
       <w:r>
         <w:rPr>

</xml_diff>